<commit_message>
agregar cambios de Casos de Uso
</commit_message>
<xml_diff>
--- a/01_proyecto/trim2/02_casos_de_uso/Plantilla_Casos_de_Usos FINAL.docx
+++ b/01_proyecto/trim2/02_casos_de_uso/Plantilla_Casos_de_Usos FINAL.docx
@@ -20415,7 +20415,7 @@
               </w:rPr>
             </w:pPr>
             <w:r>
-              <w:t>Gestionar inventario, incluyendo tallas y colores</w:t>
+              <w:t>Gestionar inventario, incluyendo colores</w:t>
             </w:r>
           </w:p>
         </w:tc>
@@ -20662,7 +20662,7 @@
               </w:rPr>
             </w:pPr>
             <w:r>
-              <w:t>El administrador podrá gestionar el inventario de productos, incluyendo las tallas y colores disponibles, para asegurar que la tienda esté actualizada.</w:t>
+              <w:t>El administrador podrá gestionar el inventario de productos, incluyendo colores disponibles, para asegurar que la tienda esté actualizada.</w:t>
             </w:r>
           </w:p>
         </w:tc>
@@ -20948,7 +20948,7 @@
               <w:ind w:left="0" w:hanging="2"/>
             </w:pPr>
             <w:r>
-              <w:t>El sistema muestra la información de los productos (productos, tallas y colores)</w:t>
+              <w:t xml:space="preserve">El sistema muestra la información de los productos </w:t>
             </w:r>
           </w:p>
         </w:tc>
@@ -21015,7 +21015,7 @@
               <w:ind w:left="0" w:hanging="2"/>
             </w:pPr>
             <w:r>
-              <w:t>El actor puede realizar ajustes del inventario (productos, tallas y colores)</w:t>
+              <w:t>El actor puede realizar ajustes del inventario</w:t>
             </w:r>
           </w:p>
         </w:tc>
@@ -21946,7 +21946,16 @@
                 <w:sz w:val="22"/>
                 <w:szCs w:val="22"/>
               </w:rPr>
-              <w:t>Crear y administrar categorías y subcategorías</w:t>
+              <w:t>A</w:t>
+            </w:r>
+            <w:r>
+              <w:rPr>
+                <w:rFonts w:ascii="Arial" w:eastAsia="Arial" w:hAnsi="Arial" w:cs="Arial"/>
+                <w:b/>
+                <w:sz w:val="22"/>
+                <w:szCs w:val="22"/>
+              </w:rPr>
+              <w:t>dministrar categorías</w:t>
             </w:r>
           </w:p>
         </w:tc>
@@ -22198,7 +22207,39 @@
                 <w:sz w:val="22"/>
                 <w:szCs w:val="22"/>
               </w:rPr>
-              <w:t>El administrador podrá crear y organizar productos en categorías y subcategorías, facilitando la navegación y la búsqueda de productos por parte de los usuarios.</w:t>
+              <w:t xml:space="preserve">El administrador podrá </w:t>
+            </w:r>
+            <w:r>
+              <w:rPr>
+                <w:rFonts w:ascii="Arial" w:eastAsia="Arial" w:hAnsi="Arial" w:cs="Arial"/>
+                <w:sz w:val="22"/>
+                <w:szCs w:val="22"/>
+              </w:rPr>
+              <w:t>administrar</w:t>
+            </w:r>
+            <w:r>
+              <w:rPr>
+                <w:rFonts w:ascii="Arial" w:eastAsia="Arial" w:hAnsi="Arial" w:cs="Arial"/>
+                <w:sz w:val="22"/>
+                <w:szCs w:val="22"/>
+              </w:rPr>
+              <w:t xml:space="preserve"> productos en categoría</w:t>
+            </w:r>
+            <w:r>
+              <w:rPr>
+                <w:rFonts w:ascii="Arial" w:eastAsia="Arial" w:hAnsi="Arial" w:cs="Arial"/>
+                <w:sz w:val="22"/>
+                <w:szCs w:val="22"/>
+              </w:rPr>
+              <w:t>s</w:t>
+            </w:r>
+            <w:r>
+              <w:rPr>
+                <w:rFonts w:ascii="Arial" w:eastAsia="Arial" w:hAnsi="Arial" w:cs="Arial"/>
+                <w:sz w:val="22"/>
+                <w:szCs w:val="22"/>
+              </w:rPr>
+              <w:t>, facilitando la navegación y la búsqueda de productos por parte de los usuarios.</w:t>
             </w:r>
           </w:p>
         </w:tc>
@@ -22440,12 +22481,7 @@
               </w:rPr>
             </w:pPr>
             <w:r>
-              <w:rPr>
-                <w:rFonts w:ascii="Arial" w:eastAsia="Arial" w:hAnsi="Arial" w:cs="Arial"/>
-                <w:sz w:val="22"/>
-                <w:szCs w:val="22"/>
-              </w:rPr>
-              <w:t>El actor inicia sesión</w:t>
+              <w:t xml:space="preserve">El actor accede al módulo de gestión de inventario.  </w:t>
             </w:r>
           </w:p>
         </w:tc>
@@ -22517,12 +22553,7 @@
               </w:rPr>
             </w:pPr>
             <w:r>
-              <w:rPr>
-                <w:rFonts w:ascii="Arial" w:eastAsia="Arial" w:hAnsi="Arial" w:cs="Arial"/>
-                <w:sz w:val="22"/>
-                <w:szCs w:val="22"/>
-              </w:rPr>
-              <w:t>El actor selecciona la sección de edición de pagina</w:t>
+              <w:t>El sistema muestra la información de los productos</w:t>
             </w:r>
           </w:p>
         </w:tc>
@@ -22594,12 +22625,10 @@
               </w:rPr>
             </w:pPr>
             <w:r>
-              <w:rPr>
-                <w:rFonts w:ascii="Arial" w:eastAsia="Arial" w:hAnsi="Arial" w:cs="Arial"/>
-                <w:sz w:val="22"/>
-                <w:szCs w:val="22"/>
-              </w:rPr>
-              <w:t>El actor se dirige a la parte de categorías</w:t>
+              <w:t xml:space="preserve">El actor puede </w:t>
+            </w:r>
+            <w:r>
+              <w:t>realizar la gestión de las categorías</w:t>
             </w:r>
           </w:p>
         </w:tc>
@@ -22676,7 +22705,15 @@
                 <w:sz w:val="22"/>
                 <w:szCs w:val="22"/>
               </w:rPr>
-              <w:t>El actor agrega u organiza las categorías</w:t>
+              <w:t xml:space="preserve">El actor </w:t>
+            </w:r>
+            <w:r>
+              <w:rPr>
+                <w:rFonts w:ascii="Arial" w:eastAsia="Arial" w:hAnsi="Arial" w:cs="Arial"/>
+                <w:sz w:val="22"/>
+                <w:szCs w:val="22"/>
+              </w:rPr>
+              <w:t>guarda los ajustes</w:t>
             </w:r>
           </w:p>
         </w:tc>
@@ -22790,8 +22827,26 @@
                 <w:sz w:val="22"/>
                 <w:szCs w:val="22"/>
               </w:rPr>
-              <w:t>El actor puede agregar u organizar categorías o subcategorías</w:t>
-            </w:r>
+              <w:t xml:space="preserve">El actor puede </w:t>
+            </w:r>
+            <w:r>
+              <w:rPr>
+                <w:rFonts w:ascii="Arial" w:eastAsia="Arial" w:hAnsi="Arial" w:cs="Arial"/>
+                <w:sz w:val="22"/>
+                <w:szCs w:val="22"/>
+              </w:rPr>
+              <w:t xml:space="preserve">utilizar las </w:t>
+            </w:r>
+            <w:proofErr w:type="spellStart"/>
+            <w:r>
+              <w:rPr>
+                <w:rFonts w:ascii="Arial" w:eastAsia="Arial" w:hAnsi="Arial" w:cs="Arial"/>
+                <w:sz w:val="22"/>
+                <w:szCs w:val="22"/>
+              </w:rPr>
+              <w:t>categorias</w:t>
+            </w:r>
+            <w:proofErr w:type="spellEnd"/>
           </w:p>
         </w:tc>
       </w:tr>
@@ -27767,25 +27822,7 @@
                 <w:sz w:val="22"/>
                 <w:szCs w:val="22"/>
               </w:rPr>
-              <w:t xml:space="preserve">No se pudo realizar el </w:t>
-            </w:r>
-            <w:proofErr w:type="spellStart"/>
-            <w:r>
-              <w:rPr>
-                <w:rFonts w:ascii="Arial" w:eastAsia="Arial" w:hAnsi="Arial" w:cs="Arial"/>
-                <w:sz w:val="22"/>
-                <w:szCs w:val="22"/>
-              </w:rPr>
-              <w:t>calculo</w:t>
-            </w:r>
-            <w:proofErr w:type="spellEnd"/>
-            <w:r>
-              <w:rPr>
-                <w:rFonts w:ascii="Arial" w:eastAsia="Arial" w:hAnsi="Arial" w:cs="Arial"/>
-                <w:sz w:val="22"/>
-                <w:szCs w:val="22"/>
-              </w:rPr>
-              <w:t xml:space="preserve"> de la compra por un error del sistema</w:t>
+              <w:t>No se pudo realizar el calculo de la compra por un error del sistema</w:t>
             </w:r>
           </w:p>
         </w:tc>
@@ -55575,28 +55612,28 @@
 </file>
 
 <file path=customXml/item1.xml><?xml version="1.0" encoding="utf-8"?>
+<b:Sources xmlns:b="http://schemas.openxmlformats.org/officeDocument/2006/bibliography" xmlns="http://schemas.openxmlformats.org/officeDocument/2006/bibliography" SelectedStyle="\APASixthEditionOfficeOnline.xsl" StyleName="APA" Version="6"/>
+</file>
+
+<file path=customXml/item2.xml><?xml version="1.0" encoding="utf-8"?>
 <go:gDocsCustomXmlDataStorage xmlns:go="http://customooxmlschemas.google.com/" xmlns:r="http://schemas.openxmlformats.org/officeDocument/2006/relationships" uri="GoogleDocsCustomDataVersion2">
   <go:docsCustomData xmlns:go="http://customooxmlschemas.google.com/" roundtripDataSignature="AMtx7mhDqlZfX/xQTJH2LoW5k0hNor4+zw==">CgMxLjAaHwoBMBIaChgICVIUChJ0YWJsZS5tNm8yOXBzNW9hcmY4AHIhMTk5YW13MlZTNnNjc21JYW1FRjNsZUl5ZmdhekJKbkc1</go:docsCustomData>
 </go:gDocsCustomXmlDataStorage>
 </file>
 
-<file path=customXml/item2.xml><?xml version="1.0" encoding="utf-8"?>
-<b:Sources xmlns:b="http://schemas.openxmlformats.org/officeDocument/2006/bibliography" xmlns="http://schemas.openxmlformats.org/officeDocument/2006/bibliography" SelectedStyle="\APASixthEditionOfficeOnline.xsl" StyleName="APA" Version="6"/>
+<file path=customXml/itemProps1.xml><?xml version="1.0" encoding="utf-8"?>
+<ds:datastoreItem xmlns:ds="http://schemas.openxmlformats.org/officeDocument/2006/customXml" ds:itemID="{22132985-FE5B-4289-8888-26BF9381A523}">
+  <ds:schemaRefs>
+    <ds:schemaRef ds:uri="http://schemas.openxmlformats.org/officeDocument/2006/bibliography"/>
+  </ds:schemaRefs>
+</ds:datastoreItem>
 </file>
 
-<file path=customXml/itemProps1.xml><?xml version="1.0" encoding="utf-8"?>
+<file path=customXml/itemProps2.xml><?xml version="1.0" encoding="utf-8"?>
 <ds:datastoreItem xmlns:ds="http://schemas.openxmlformats.org/officeDocument/2006/customXml" ds:itemID="{11111111-1234-1234-1234-123412341234}">
   <ds:schemaRefs>
     <ds:schemaRef ds:uri="http://customooxmlschemas.google.com/"/>
     <ds:schemaRef ds:uri="http://schemas.openxmlformats.org/officeDocument/2006/relationships"/>
   </ds:schemaRefs>
 </ds:datastoreItem>
-</file>
-
-<file path=customXml/itemProps2.xml><?xml version="1.0" encoding="utf-8"?>
-<ds:datastoreItem xmlns:ds="http://schemas.openxmlformats.org/officeDocument/2006/customXml" ds:itemID="{22132985-FE5B-4289-8888-26BF9381A523}">
-  <ds:schemaRefs>
-    <ds:schemaRef ds:uri="http://schemas.openxmlformats.org/officeDocument/2006/bibliography"/>
-  </ds:schemaRefs>
-</ds:datastoreItem>
 </file>
</xml_diff>

<commit_message>
agregar corecciones casos de uso
</commit_message>
<xml_diff>
--- a/01_proyecto/trim2/02_casos_de_uso/Plantilla_Casos_de_Usos FINAL.docx
+++ b/01_proyecto/trim2/02_casos_de_uso/Plantilla_Casos_de_Usos FINAL.docx
@@ -20415,7 +20415,13 @@
               </w:rPr>
             </w:pPr>
             <w:r>
-              <w:t>Gestionar inventario, incluyendo colores</w:t>
+              <w:t>Gestionar inventario</w:t>
+            </w:r>
+            <w:r>
+              <w:t xml:space="preserve"> y</w:t>
+            </w:r>
+            <w:r>
+              <w:t xml:space="preserve"> colores</w:t>
             </w:r>
           </w:p>
         </w:tc>
@@ -23571,7 +23577,25 @@
                 <w:sz w:val="22"/>
                 <w:szCs w:val="22"/>
               </w:rPr>
-              <w:t xml:space="preserve">Configurar precios y descuentos de los productos                          </w:t>
+              <w:t>Configurar</w:t>
+            </w:r>
+            <w:r>
+              <w:rPr>
+                <w:rFonts w:ascii="Arial" w:eastAsia="Arial" w:hAnsi="Arial" w:cs="Arial"/>
+                <w:b/>
+                <w:sz w:val="22"/>
+                <w:szCs w:val="22"/>
+              </w:rPr>
+              <w:t xml:space="preserve"> promociones</w:t>
+            </w:r>
+            <w:r>
+              <w:rPr>
+                <w:rFonts w:ascii="Arial" w:eastAsia="Arial" w:hAnsi="Arial" w:cs="Arial"/>
+                <w:b/>
+                <w:sz w:val="22"/>
+                <w:szCs w:val="22"/>
+              </w:rPr>
+              <w:t xml:space="preserve"> de los productos                          </w:t>
             </w:r>
           </w:p>
         </w:tc>
@@ -23823,7 +23847,23 @@
                 <w:sz w:val="22"/>
                 <w:szCs w:val="22"/>
               </w:rPr>
-              <w:t>El administrador podrá configurar los precios de los productos, así como aplicar descuentos y promociones específicas según sea necesario.</w:t>
+              <w:t xml:space="preserve">El administrador podrá configurar </w:t>
+            </w:r>
+            <w:r>
+              <w:rPr>
+                <w:rFonts w:ascii="Arial" w:eastAsia="Arial" w:hAnsi="Arial" w:cs="Arial"/>
+                <w:sz w:val="22"/>
+                <w:szCs w:val="22"/>
+              </w:rPr>
+              <w:t>las</w:t>
+            </w:r>
+            <w:r>
+              <w:rPr>
+                <w:rFonts w:ascii="Arial" w:eastAsia="Arial" w:hAnsi="Arial" w:cs="Arial"/>
+                <w:sz w:val="22"/>
+                <w:szCs w:val="22"/>
+              </w:rPr>
+              <w:t xml:space="preserve"> promociones específicas según sea necesario.</w:t>
             </w:r>
           </w:p>
         </w:tc>
@@ -24146,7 +24186,15 @@
                 <w:sz w:val="22"/>
                 <w:szCs w:val="22"/>
               </w:rPr>
-              <w:t>El actor selecciona la sección productos</w:t>
+              <w:t xml:space="preserve">El actor </w:t>
+            </w:r>
+            <w:r>
+              <w:rPr>
+                <w:rFonts w:ascii="Arial" w:eastAsia="Arial" w:hAnsi="Arial" w:cs="Arial"/>
+                <w:sz w:val="22"/>
+                <w:szCs w:val="22"/>
+              </w:rPr>
+              <w:t>busca la sección de promociones</w:t>
             </w:r>
           </w:p>
         </w:tc>
@@ -24223,8 +24271,26 @@
                 <w:sz w:val="22"/>
                 <w:szCs w:val="22"/>
               </w:rPr>
-              <w:t>El sistema detecta si hay productos</w:t>
-            </w:r>
+              <w:t xml:space="preserve">El </w:t>
+            </w:r>
+            <w:r>
+              <w:rPr>
+                <w:rFonts w:ascii="Arial" w:eastAsia="Arial" w:hAnsi="Arial" w:cs="Arial"/>
+                <w:sz w:val="22"/>
+                <w:szCs w:val="22"/>
+              </w:rPr>
+              <w:t xml:space="preserve">actor crea una </w:t>
+            </w:r>
+            <w:proofErr w:type="spellStart"/>
+            <w:r>
+              <w:rPr>
+                <w:rFonts w:ascii="Arial" w:eastAsia="Arial" w:hAnsi="Arial" w:cs="Arial"/>
+                <w:sz w:val="22"/>
+                <w:szCs w:val="22"/>
+              </w:rPr>
+              <w:t>promocion</w:t>
+            </w:r>
+            <w:proofErr w:type="spellEnd"/>
           </w:p>
         </w:tc>
       </w:tr>
@@ -24377,7 +24443,15 @@
                 <w:sz w:val="22"/>
                 <w:szCs w:val="22"/>
               </w:rPr>
-              <w:t>El actor actualiza el valor del producto o aplica un descuento</w:t>
+              <w:t xml:space="preserve">El actor aplica </w:t>
+            </w:r>
+            <w:r>
+              <w:rPr>
+                <w:rFonts w:ascii="Arial" w:eastAsia="Arial" w:hAnsi="Arial" w:cs="Arial"/>
+                <w:sz w:val="22"/>
+                <w:szCs w:val="22"/>
+              </w:rPr>
+              <w:t>la promoción a un producto</w:t>
             </w:r>
           </w:p>
         </w:tc>
@@ -24645,7 +24719,23 @@
                 <w:sz w:val="22"/>
                 <w:szCs w:val="22"/>
               </w:rPr>
-              <w:t xml:space="preserve">El sistema muestra el nuevo precio o descuento del producto </w:t>
+              <w:t xml:space="preserve">El sistema muestra </w:t>
+            </w:r>
+            <w:r>
+              <w:rPr>
+                <w:rFonts w:ascii="Arial" w:eastAsia="Arial" w:hAnsi="Arial" w:cs="Arial"/>
+                <w:sz w:val="22"/>
+                <w:szCs w:val="22"/>
+              </w:rPr>
+              <w:t>la promocion</w:t>
+            </w:r>
+            <w:r>
+              <w:rPr>
+                <w:rFonts w:ascii="Arial" w:eastAsia="Arial" w:hAnsi="Arial" w:cs="Arial"/>
+                <w:sz w:val="22"/>
+                <w:szCs w:val="22"/>
+              </w:rPr>
+              <w:t xml:space="preserve"> del producto </w:t>
             </w:r>
           </w:p>
         </w:tc>
@@ -55612,28 +55702,28 @@
 </file>
 
 <file path=customXml/item1.xml><?xml version="1.0" encoding="utf-8"?>
-<b:Sources xmlns:b="http://schemas.openxmlformats.org/officeDocument/2006/bibliography" xmlns="http://schemas.openxmlformats.org/officeDocument/2006/bibliography" SelectedStyle="\APASixthEditionOfficeOnline.xsl" StyleName="APA" Version="6"/>
-</file>
-
-<file path=customXml/item2.xml><?xml version="1.0" encoding="utf-8"?>
 <go:gDocsCustomXmlDataStorage xmlns:go="http://customooxmlschemas.google.com/" xmlns:r="http://schemas.openxmlformats.org/officeDocument/2006/relationships" uri="GoogleDocsCustomDataVersion2">
   <go:docsCustomData xmlns:go="http://customooxmlschemas.google.com/" roundtripDataSignature="AMtx7mhDqlZfX/xQTJH2LoW5k0hNor4+zw==">CgMxLjAaHwoBMBIaChgICVIUChJ0YWJsZS5tNm8yOXBzNW9hcmY4AHIhMTk5YW13MlZTNnNjc21JYW1FRjNsZUl5ZmdhekJKbkc1</go:docsCustomData>
 </go:gDocsCustomXmlDataStorage>
 </file>
 
-<file path=customXml/itemProps1.xml><?xml version="1.0" encoding="utf-8"?>
-<ds:datastoreItem xmlns:ds="http://schemas.openxmlformats.org/officeDocument/2006/customXml" ds:itemID="{22132985-FE5B-4289-8888-26BF9381A523}">
-  <ds:schemaRefs>
-    <ds:schemaRef ds:uri="http://schemas.openxmlformats.org/officeDocument/2006/bibliography"/>
-  </ds:schemaRefs>
-</ds:datastoreItem>
+<file path=customXml/item2.xml><?xml version="1.0" encoding="utf-8"?>
+<b:Sources xmlns:b="http://schemas.openxmlformats.org/officeDocument/2006/bibliography" xmlns="http://schemas.openxmlformats.org/officeDocument/2006/bibliography" SelectedStyle="\APASixthEditionOfficeOnline.xsl" StyleName="APA" Version="6"/>
 </file>
 
-<file path=customXml/itemProps2.xml><?xml version="1.0" encoding="utf-8"?>
+<file path=customXml/itemProps1.xml><?xml version="1.0" encoding="utf-8"?>
 <ds:datastoreItem xmlns:ds="http://schemas.openxmlformats.org/officeDocument/2006/customXml" ds:itemID="{11111111-1234-1234-1234-123412341234}">
   <ds:schemaRefs>
     <ds:schemaRef ds:uri="http://customooxmlschemas.google.com/"/>
     <ds:schemaRef ds:uri="http://schemas.openxmlformats.org/officeDocument/2006/relationships"/>
   </ds:schemaRefs>
 </ds:datastoreItem>
+</file>
+
+<file path=customXml/itemProps2.xml><?xml version="1.0" encoding="utf-8"?>
+<ds:datastoreItem xmlns:ds="http://schemas.openxmlformats.org/officeDocument/2006/customXml" ds:itemID="{22132985-FE5B-4289-8888-26BF9381A523}">
+  <ds:schemaRefs>
+    <ds:schemaRef ds:uri="http://schemas.openxmlformats.org/officeDocument/2006/bibliography"/>
+  </ds:schemaRefs>
+</ds:datastoreItem>
 </file>
</xml_diff>